<commit_message>
Progress Revisi 03 Agustus 2026 02:10
</commit_message>
<xml_diff>
--- a/Berkas Tugas Akhir/Pasca Sempro/TA-004 (Form Asistensi Tugas Akhir).docx
+++ b/Berkas Tugas Akhir/Pasca Sempro/TA-004 (Form Asistensi Tugas Akhir).docx
@@ -398,8 +398,6 @@
         </w:rPr>
         <w:t xml:space="preserve"> </w:t>
       </w:r>
-      <w:bookmarkStart w:id="1" w:name="_GoBack"/>
-      <w:bookmarkEnd w:id="1"/>
       <w:r>
         <w:rPr>
           <w:rFonts w:ascii="Times New Roman" w:hAnsi="Times New Roman" w:cs="Times New Roman"/>
@@ -1425,6 +1423,590 @@
           </w:p>
         </w:tc>
       </w:tr>
+      <w:tr>
+        <w:trPr>
+          <w:trHeight w:val="746"/>
+        </w:trPr>
+        <w:tc>
+          <w:tcPr>
+            <w:tcW w:w="636" w:type="dxa"/>
+            <w:vAlign w:val="center"/>
+          </w:tcPr>
+          <w:p>
+            <w:pPr>
+              <w:rPr>
+                <w:rFonts w:ascii="Times New Roman" w:hAnsi="Times New Roman" w:cs="Times New Roman"/>
+                <w:b/>
+                <w:bCs/>
+              </w:rPr>
+            </w:pPr>
+            <w:r>
+              <w:rPr>
+                <w:rFonts w:ascii="Times New Roman" w:hAnsi="Times New Roman" w:cs="Times New Roman"/>
+                <w:b/>
+                <w:bCs/>
+              </w:rPr>
+              <w:t>13.</w:t>
+            </w:r>
+          </w:p>
+        </w:tc>
+        <w:tc>
+          <w:tcPr>
+            <w:tcW w:w="2262" w:type="dxa"/>
+            <w:vAlign w:val="center"/>
+          </w:tcPr>
+          <w:p>
+            <w:pPr>
+              <w:rPr>
+                <w:rFonts w:ascii="Times New Roman" w:hAnsi="Times New Roman" w:cs="Times New Roman"/>
+                <w:b/>
+                <w:bCs/>
+              </w:rPr>
+            </w:pPr>
+          </w:p>
+        </w:tc>
+        <w:tc>
+          <w:tcPr>
+            <w:tcW w:w="5130" w:type="dxa"/>
+            <w:vAlign w:val="center"/>
+          </w:tcPr>
+          <w:p>
+            <w:pPr>
+              <w:rPr>
+                <w:rFonts w:ascii="Times New Roman" w:hAnsi="Times New Roman" w:cs="Times New Roman"/>
+                <w:b/>
+                <w:bCs/>
+              </w:rPr>
+            </w:pPr>
+          </w:p>
+        </w:tc>
+        <w:tc>
+          <w:tcPr>
+            <w:tcW w:w="2041" w:type="dxa"/>
+            <w:vAlign w:val="center"/>
+          </w:tcPr>
+          <w:p>
+            <w:pPr>
+              <w:rPr>
+                <w:rFonts w:ascii="Times New Roman" w:hAnsi="Times New Roman" w:cs="Times New Roman"/>
+                <w:b/>
+                <w:bCs/>
+              </w:rPr>
+            </w:pPr>
+          </w:p>
+        </w:tc>
+      </w:tr>
+      <w:tr>
+        <w:trPr>
+          <w:trHeight w:val="746"/>
+        </w:trPr>
+        <w:tc>
+          <w:tcPr>
+            <w:tcW w:w="636" w:type="dxa"/>
+            <w:vAlign w:val="center"/>
+          </w:tcPr>
+          <w:p>
+            <w:pPr>
+              <w:rPr>
+                <w:rFonts w:ascii="Times New Roman" w:hAnsi="Times New Roman" w:cs="Times New Roman"/>
+                <w:b/>
+                <w:bCs/>
+              </w:rPr>
+            </w:pPr>
+            <w:r>
+              <w:rPr>
+                <w:rFonts w:ascii="Times New Roman" w:hAnsi="Times New Roman" w:cs="Times New Roman"/>
+                <w:b/>
+                <w:bCs/>
+              </w:rPr>
+              <w:t>14.</w:t>
+            </w:r>
+          </w:p>
+        </w:tc>
+        <w:tc>
+          <w:tcPr>
+            <w:tcW w:w="2262" w:type="dxa"/>
+            <w:vAlign w:val="center"/>
+          </w:tcPr>
+          <w:p>
+            <w:pPr>
+              <w:rPr>
+                <w:rFonts w:ascii="Times New Roman" w:hAnsi="Times New Roman" w:cs="Times New Roman"/>
+                <w:b/>
+                <w:bCs/>
+              </w:rPr>
+            </w:pPr>
+          </w:p>
+        </w:tc>
+        <w:tc>
+          <w:tcPr>
+            <w:tcW w:w="5130" w:type="dxa"/>
+            <w:vAlign w:val="center"/>
+          </w:tcPr>
+          <w:p>
+            <w:pPr>
+              <w:rPr>
+                <w:rFonts w:ascii="Times New Roman" w:hAnsi="Times New Roman" w:cs="Times New Roman"/>
+                <w:b/>
+                <w:bCs/>
+              </w:rPr>
+            </w:pPr>
+          </w:p>
+        </w:tc>
+        <w:tc>
+          <w:tcPr>
+            <w:tcW w:w="2041" w:type="dxa"/>
+            <w:vAlign w:val="center"/>
+          </w:tcPr>
+          <w:p>
+            <w:pPr>
+              <w:rPr>
+                <w:rFonts w:ascii="Times New Roman" w:hAnsi="Times New Roman" w:cs="Times New Roman"/>
+                <w:b/>
+                <w:bCs/>
+              </w:rPr>
+            </w:pPr>
+          </w:p>
+        </w:tc>
+      </w:tr>
+      <w:tr>
+        <w:trPr>
+          <w:trHeight w:val="746"/>
+        </w:trPr>
+        <w:tc>
+          <w:tcPr>
+            <w:tcW w:w="636" w:type="dxa"/>
+            <w:vAlign w:val="center"/>
+          </w:tcPr>
+          <w:p>
+            <w:pPr>
+              <w:rPr>
+                <w:rFonts w:ascii="Times New Roman" w:hAnsi="Times New Roman" w:cs="Times New Roman"/>
+                <w:b/>
+                <w:bCs/>
+              </w:rPr>
+            </w:pPr>
+            <w:r>
+              <w:rPr>
+                <w:rFonts w:ascii="Times New Roman" w:hAnsi="Times New Roman" w:cs="Times New Roman"/>
+                <w:b/>
+                <w:bCs/>
+              </w:rPr>
+              <w:t>15.</w:t>
+            </w:r>
+          </w:p>
+        </w:tc>
+        <w:tc>
+          <w:tcPr>
+            <w:tcW w:w="2262" w:type="dxa"/>
+            <w:vAlign w:val="center"/>
+          </w:tcPr>
+          <w:p>
+            <w:pPr>
+              <w:rPr>
+                <w:rFonts w:ascii="Times New Roman" w:hAnsi="Times New Roman" w:cs="Times New Roman"/>
+                <w:b/>
+                <w:bCs/>
+              </w:rPr>
+            </w:pPr>
+          </w:p>
+        </w:tc>
+        <w:tc>
+          <w:tcPr>
+            <w:tcW w:w="5130" w:type="dxa"/>
+            <w:vAlign w:val="center"/>
+          </w:tcPr>
+          <w:p>
+            <w:pPr>
+              <w:rPr>
+                <w:rFonts w:ascii="Times New Roman" w:hAnsi="Times New Roman" w:cs="Times New Roman"/>
+                <w:b/>
+                <w:bCs/>
+              </w:rPr>
+            </w:pPr>
+          </w:p>
+        </w:tc>
+        <w:tc>
+          <w:tcPr>
+            <w:tcW w:w="2041" w:type="dxa"/>
+            <w:vAlign w:val="center"/>
+          </w:tcPr>
+          <w:p>
+            <w:pPr>
+              <w:rPr>
+                <w:rFonts w:ascii="Times New Roman" w:hAnsi="Times New Roman" w:cs="Times New Roman"/>
+                <w:b/>
+                <w:bCs/>
+              </w:rPr>
+            </w:pPr>
+          </w:p>
+        </w:tc>
+      </w:tr>
+      <w:tr>
+        <w:trPr>
+          <w:trHeight w:val="746"/>
+        </w:trPr>
+        <w:tc>
+          <w:tcPr>
+            <w:tcW w:w="636" w:type="dxa"/>
+            <w:vAlign w:val="center"/>
+          </w:tcPr>
+          <w:p>
+            <w:pPr>
+              <w:rPr>
+                <w:rFonts w:ascii="Times New Roman" w:hAnsi="Times New Roman" w:cs="Times New Roman"/>
+                <w:b/>
+                <w:bCs/>
+              </w:rPr>
+            </w:pPr>
+            <w:r>
+              <w:rPr>
+                <w:rFonts w:ascii="Times New Roman" w:hAnsi="Times New Roman" w:cs="Times New Roman"/>
+                <w:b/>
+                <w:bCs/>
+              </w:rPr>
+              <w:t>16.</w:t>
+            </w:r>
+          </w:p>
+        </w:tc>
+        <w:tc>
+          <w:tcPr>
+            <w:tcW w:w="2262" w:type="dxa"/>
+            <w:vAlign w:val="center"/>
+          </w:tcPr>
+          <w:p>
+            <w:pPr>
+              <w:rPr>
+                <w:rFonts w:ascii="Times New Roman" w:hAnsi="Times New Roman" w:cs="Times New Roman"/>
+                <w:b/>
+                <w:bCs/>
+              </w:rPr>
+            </w:pPr>
+          </w:p>
+        </w:tc>
+        <w:tc>
+          <w:tcPr>
+            <w:tcW w:w="5130" w:type="dxa"/>
+            <w:vAlign w:val="center"/>
+          </w:tcPr>
+          <w:p>
+            <w:pPr>
+              <w:rPr>
+                <w:rFonts w:ascii="Times New Roman" w:hAnsi="Times New Roman" w:cs="Times New Roman"/>
+                <w:b/>
+                <w:bCs/>
+              </w:rPr>
+            </w:pPr>
+          </w:p>
+        </w:tc>
+        <w:tc>
+          <w:tcPr>
+            <w:tcW w:w="2041" w:type="dxa"/>
+            <w:vAlign w:val="center"/>
+          </w:tcPr>
+          <w:p>
+            <w:pPr>
+              <w:rPr>
+                <w:rFonts w:ascii="Times New Roman" w:hAnsi="Times New Roman" w:cs="Times New Roman"/>
+                <w:b/>
+                <w:bCs/>
+              </w:rPr>
+            </w:pPr>
+          </w:p>
+        </w:tc>
+      </w:tr>
+      <w:tr>
+        <w:trPr>
+          <w:trHeight w:val="746"/>
+        </w:trPr>
+        <w:tc>
+          <w:tcPr>
+            <w:tcW w:w="636" w:type="dxa"/>
+            <w:vAlign w:val="center"/>
+          </w:tcPr>
+          <w:p>
+            <w:pPr>
+              <w:rPr>
+                <w:rFonts w:ascii="Times New Roman" w:hAnsi="Times New Roman" w:cs="Times New Roman"/>
+                <w:b/>
+                <w:bCs/>
+              </w:rPr>
+            </w:pPr>
+            <w:r>
+              <w:rPr>
+                <w:rFonts w:ascii="Times New Roman" w:hAnsi="Times New Roman" w:cs="Times New Roman"/>
+                <w:b/>
+                <w:bCs/>
+              </w:rPr>
+              <w:t>17.</w:t>
+            </w:r>
+          </w:p>
+        </w:tc>
+        <w:tc>
+          <w:tcPr>
+            <w:tcW w:w="2262" w:type="dxa"/>
+            <w:vAlign w:val="center"/>
+          </w:tcPr>
+          <w:p>
+            <w:pPr>
+              <w:rPr>
+                <w:rFonts w:ascii="Times New Roman" w:hAnsi="Times New Roman" w:cs="Times New Roman"/>
+                <w:b/>
+                <w:bCs/>
+              </w:rPr>
+            </w:pPr>
+          </w:p>
+        </w:tc>
+        <w:tc>
+          <w:tcPr>
+            <w:tcW w:w="5130" w:type="dxa"/>
+            <w:vAlign w:val="center"/>
+          </w:tcPr>
+          <w:p>
+            <w:pPr>
+              <w:rPr>
+                <w:rFonts w:ascii="Times New Roman" w:hAnsi="Times New Roman" w:cs="Times New Roman"/>
+                <w:b/>
+                <w:bCs/>
+              </w:rPr>
+            </w:pPr>
+          </w:p>
+        </w:tc>
+        <w:tc>
+          <w:tcPr>
+            <w:tcW w:w="2041" w:type="dxa"/>
+            <w:vAlign w:val="center"/>
+          </w:tcPr>
+          <w:p>
+            <w:pPr>
+              <w:rPr>
+                <w:rFonts w:ascii="Times New Roman" w:hAnsi="Times New Roman" w:cs="Times New Roman"/>
+                <w:b/>
+                <w:bCs/>
+              </w:rPr>
+            </w:pPr>
+          </w:p>
+        </w:tc>
+      </w:tr>
+      <w:tr>
+        <w:trPr>
+          <w:trHeight w:val="746"/>
+        </w:trPr>
+        <w:tc>
+          <w:tcPr>
+            <w:tcW w:w="636" w:type="dxa"/>
+            <w:vAlign w:val="center"/>
+          </w:tcPr>
+          <w:p>
+            <w:pPr>
+              <w:rPr>
+                <w:rFonts w:ascii="Times New Roman" w:hAnsi="Times New Roman" w:cs="Times New Roman"/>
+                <w:b/>
+                <w:bCs/>
+              </w:rPr>
+            </w:pPr>
+            <w:r>
+              <w:rPr>
+                <w:rFonts w:ascii="Times New Roman" w:hAnsi="Times New Roman" w:cs="Times New Roman"/>
+                <w:b/>
+                <w:bCs/>
+              </w:rPr>
+              <w:t>18.</w:t>
+            </w:r>
+          </w:p>
+        </w:tc>
+        <w:tc>
+          <w:tcPr>
+            <w:tcW w:w="2262" w:type="dxa"/>
+            <w:vAlign w:val="center"/>
+          </w:tcPr>
+          <w:p>
+            <w:pPr>
+              <w:rPr>
+                <w:rFonts w:ascii="Times New Roman" w:hAnsi="Times New Roman" w:cs="Times New Roman"/>
+                <w:b/>
+                <w:bCs/>
+              </w:rPr>
+            </w:pPr>
+          </w:p>
+        </w:tc>
+        <w:tc>
+          <w:tcPr>
+            <w:tcW w:w="5130" w:type="dxa"/>
+            <w:vAlign w:val="center"/>
+          </w:tcPr>
+          <w:p>
+            <w:pPr>
+              <w:rPr>
+                <w:rFonts w:ascii="Times New Roman" w:hAnsi="Times New Roman" w:cs="Times New Roman"/>
+                <w:b/>
+                <w:bCs/>
+              </w:rPr>
+            </w:pPr>
+          </w:p>
+        </w:tc>
+        <w:tc>
+          <w:tcPr>
+            <w:tcW w:w="2041" w:type="dxa"/>
+            <w:vAlign w:val="center"/>
+          </w:tcPr>
+          <w:p>
+            <w:pPr>
+              <w:rPr>
+                <w:rFonts w:ascii="Times New Roman" w:hAnsi="Times New Roman" w:cs="Times New Roman"/>
+                <w:b/>
+                <w:bCs/>
+              </w:rPr>
+            </w:pPr>
+          </w:p>
+        </w:tc>
+      </w:tr>
+      <w:tr>
+        <w:trPr>
+          <w:trHeight w:val="746"/>
+        </w:trPr>
+        <w:tc>
+          <w:tcPr>
+            <w:tcW w:w="636" w:type="dxa"/>
+            <w:vAlign w:val="center"/>
+          </w:tcPr>
+          <w:p>
+            <w:pPr>
+              <w:rPr>
+                <w:rFonts w:ascii="Times New Roman" w:hAnsi="Times New Roman" w:cs="Times New Roman"/>
+                <w:b/>
+                <w:bCs/>
+              </w:rPr>
+            </w:pPr>
+            <w:r>
+              <w:rPr>
+                <w:rFonts w:ascii="Times New Roman" w:hAnsi="Times New Roman" w:cs="Times New Roman"/>
+                <w:b/>
+                <w:bCs/>
+              </w:rPr>
+              <w:t>19.</w:t>
+            </w:r>
+          </w:p>
+        </w:tc>
+        <w:tc>
+          <w:tcPr>
+            <w:tcW w:w="2262" w:type="dxa"/>
+            <w:vAlign w:val="center"/>
+          </w:tcPr>
+          <w:p>
+            <w:pPr>
+              <w:rPr>
+                <w:rFonts w:ascii="Times New Roman" w:hAnsi="Times New Roman" w:cs="Times New Roman"/>
+                <w:b/>
+                <w:bCs/>
+              </w:rPr>
+            </w:pPr>
+          </w:p>
+        </w:tc>
+        <w:tc>
+          <w:tcPr>
+            <w:tcW w:w="5130" w:type="dxa"/>
+            <w:vAlign w:val="center"/>
+          </w:tcPr>
+          <w:p>
+            <w:pPr>
+              <w:rPr>
+                <w:rFonts w:ascii="Times New Roman" w:hAnsi="Times New Roman" w:cs="Times New Roman"/>
+                <w:b/>
+                <w:bCs/>
+              </w:rPr>
+            </w:pPr>
+          </w:p>
+        </w:tc>
+        <w:tc>
+          <w:tcPr>
+            <w:tcW w:w="2041" w:type="dxa"/>
+            <w:vAlign w:val="center"/>
+          </w:tcPr>
+          <w:p>
+            <w:pPr>
+              <w:rPr>
+                <w:rFonts w:ascii="Times New Roman" w:hAnsi="Times New Roman" w:cs="Times New Roman"/>
+                <w:b/>
+                <w:bCs/>
+              </w:rPr>
+            </w:pPr>
+          </w:p>
+        </w:tc>
+      </w:tr>
+      <w:tr>
+        <w:trPr>
+          <w:trHeight w:val="746"/>
+        </w:trPr>
+        <w:tc>
+          <w:tcPr>
+            <w:tcW w:w="636" w:type="dxa"/>
+            <w:vAlign w:val="center"/>
+          </w:tcPr>
+          <w:p>
+            <w:pPr>
+              <w:rPr>
+                <w:rFonts w:ascii="Times New Roman" w:hAnsi="Times New Roman" w:cs="Times New Roman"/>
+                <w:b/>
+                <w:bCs/>
+              </w:rPr>
+            </w:pPr>
+            <w:r>
+              <w:rPr>
+                <w:rFonts w:ascii="Times New Roman" w:hAnsi="Times New Roman" w:cs="Times New Roman"/>
+                <w:b/>
+                <w:bCs/>
+              </w:rPr>
+              <w:t>20.</w:t>
+            </w:r>
+          </w:p>
+        </w:tc>
+        <w:tc>
+          <w:tcPr>
+            <w:tcW w:w="2262" w:type="dxa"/>
+            <w:vAlign w:val="center"/>
+          </w:tcPr>
+          <w:p>
+            <w:pPr>
+              <w:rPr>
+                <w:rFonts w:ascii="Times New Roman" w:hAnsi="Times New Roman" w:cs="Times New Roman"/>
+                <w:b/>
+                <w:bCs/>
+              </w:rPr>
+            </w:pPr>
+          </w:p>
+        </w:tc>
+        <w:tc>
+          <w:tcPr>
+            <w:tcW w:w="5130" w:type="dxa"/>
+            <w:vAlign w:val="center"/>
+          </w:tcPr>
+          <w:p>
+            <w:pPr>
+              <w:rPr>
+                <w:rFonts w:ascii="Times New Roman" w:hAnsi="Times New Roman" w:cs="Times New Roman"/>
+                <w:b/>
+                <w:bCs/>
+              </w:rPr>
+            </w:pPr>
+          </w:p>
+        </w:tc>
+        <w:tc>
+          <w:tcPr>
+            <w:tcW w:w="2041" w:type="dxa"/>
+            <w:vAlign w:val="center"/>
+          </w:tcPr>
+          <w:p>
+            <w:pPr>
+              <w:rPr>
+                <w:rFonts w:ascii="Times New Roman" w:hAnsi="Times New Roman" w:cs="Times New Roman"/>
+                <w:b/>
+                <w:bCs/>
+              </w:rPr>
+            </w:pPr>
+          </w:p>
+        </w:tc>
+      </w:tr>
     </w:tbl>
     <w:p>
       <w:pPr>
@@ -1502,7 +2084,23 @@
           <w:b/>
           <w:bCs/>
         </w:rPr>
-        <w:t xml:space="preserve"> Dosen Pembimbing 1</w:t>
+        <w:t xml:space="preserve"> </w:t>
+      </w:r>
+      <w:r>
+        <w:rPr>
+          <w:rFonts w:ascii="Times New Roman" w:hAnsi="Times New Roman" w:cs="Times New Roman"/>
+          <w:b/>
+          <w:bCs/>
+        </w:rPr>
+        <w:t xml:space="preserve">            </w:t>
+      </w:r>
+      <w:r>
+        <w:rPr>
+          <w:rFonts w:ascii="Times New Roman" w:hAnsi="Times New Roman" w:cs="Times New Roman"/>
+          <w:b/>
+          <w:bCs/>
+        </w:rPr>
+        <w:t>Dosen Pembimbing 1</w:t>
       </w:r>
       <w:r>
         <w:rPr>
@@ -1542,6 +2140,14 @@
           <w:b/>
           <w:bCs/>
         </w:rPr>
+        <w:t xml:space="preserve"> </w:t>
+      </w:r>
+      <w:r>
+        <w:rPr>
+          <w:rFonts w:ascii="Times New Roman" w:hAnsi="Times New Roman" w:cs="Times New Roman"/>
+          <w:b/>
+          <w:bCs/>
+        </w:rPr>
         <w:tab/>
       </w:r>
       <w:r>
@@ -1550,15 +2156,14 @@
           <w:b/>
           <w:bCs/>
         </w:rPr>
-        <w:tab/>
-      </w:r>
-      <w:r>
-        <w:rPr>
-          <w:rFonts w:ascii="Times New Roman" w:hAnsi="Times New Roman" w:cs="Times New Roman"/>
-          <w:b/>
-          <w:bCs/>
-        </w:rPr>
-        <w:tab/>
+        <w:t xml:space="preserve">     </w:t>
+      </w:r>
+      <w:r>
+        <w:rPr>
+          <w:rFonts w:ascii="Times New Roman" w:hAnsi="Times New Roman" w:cs="Times New Roman"/>
+          <w:b/>
+          <w:bCs/>
+        </w:rPr>
         <w:t>Dosen Pembimbing 2</w:t>
       </w:r>
     </w:p>
@@ -1579,6 +2184,8 @@
           <w:bCs/>
         </w:rPr>
       </w:pPr>
+      <w:bookmarkStart w:id="1" w:name="_GoBack"/>
+      <w:bookmarkEnd w:id="1"/>
     </w:p>
     <w:p>
       <w:pPr>
@@ -1588,90 +2195,6 @@
           <w:bCs/>
         </w:rPr>
       </w:pPr>
-    </w:p>
-    <w:p>
-      <w:pPr>
-        <w:rPr>
-          <w:rFonts w:ascii="Times New Roman" w:hAnsi="Times New Roman" w:cs="Times New Roman"/>
-          <w:b/>
-          <w:bCs/>
-        </w:rPr>
-      </w:pPr>
-    </w:p>
-    <w:p>
-      <w:pPr>
-        <w:rPr>
-          <w:rFonts w:ascii="Times New Roman" w:hAnsi="Times New Roman" w:cs="Times New Roman"/>
-          <w:b/>
-          <w:bCs/>
-        </w:rPr>
-      </w:pPr>
-    </w:p>
-    <w:p>
-      <w:pPr>
-        <w:rPr>
-          <w:rFonts w:ascii="Times New Roman" w:hAnsi="Times New Roman" w:cs="Times New Roman"/>
-          <w:b/>
-          <w:bCs/>
-        </w:rPr>
-      </w:pPr>
-      <w:r>
-        <w:rPr>
-          <w:rFonts w:ascii="Times New Roman" w:hAnsi="Times New Roman" w:cs="Times New Roman"/>
-          <w:b/>
-          <w:bCs/>
-        </w:rPr>
-        <w:t>(……………………………)</w:t>
-      </w:r>
-      <w:r>
-        <w:rPr>
-          <w:rFonts w:ascii="Times New Roman" w:hAnsi="Times New Roman" w:cs="Times New Roman"/>
-          <w:b/>
-          <w:bCs/>
-        </w:rPr>
-        <w:tab/>
-      </w:r>
-      <w:r>
-        <w:rPr>
-          <w:rFonts w:ascii="Times New Roman" w:hAnsi="Times New Roman" w:cs="Times New Roman"/>
-          <w:b/>
-          <w:bCs/>
-        </w:rPr>
-        <w:tab/>
-      </w:r>
-      <w:r>
-        <w:rPr>
-          <w:rFonts w:ascii="Times New Roman" w:hAnsi="Times New Roman" w:cs="Times New Roman"/>
-          <w:b/>
-          <w:bCs/>
-        </w:rPr>
-        <w:tab/>
-      </w:r>
-      <w:r>
-        <w:rPr>
-          <w:rFonts w:ascii="Times New Roman" w:hAnsi="Times New Roman" w:cs="Times New Roman"/>
-          <w:b/>
-          <w:bCs/>
-        </w:rPr>
-        <w:tab/>
-      </w:r>
-      <w:r>
-        <w:rPr>
-          <w:rFonts w:ascii="Times New Roman" w:hAnsi="Times New Roman" w:cs="Times New Roman"/>
-          <w:b/>
-          <w:bCs/>
-        </w:rPr>
-        <w:tab/>
-      </w:r>
-      <w:r>
-        <w:rPr>
-          <w:rFonts w:ascii="Times New Roman" w:hAnsi="Times New Roman" w:cs="Times New Roman"/>
-          <w:b/>
-          <w:bCs/>
-        </w:rPr>
-        <w:tab/>
-        <w:t>(……………………………)</w:t>
-      </w:r>
     </w:p>
     <w:p>
       <w:pPr>
@@ -1697,6 +2220,97 @@
           <w:docGrid w:linePitch="360"/>
         </w:sectPr>
       </w:pPr>
+      <w:r>
+        <w:rPr>
+          <w:rFonts w:ascii="Times New Roman" w:hAnsi="Times New Roman" w:cs="Times New Roman"/>
+          <w:b/>
+          <w:bCs/>
+        </w:rPr>
+        <w:t>(</w:t>
+      </w:r>
+      <w:r>
+        <w:rPr>
+          <w:rFonts w:ascii="Times New Roman" w:hAnsi="Times New Roman" w:cs="Times New Roman"/>
+          <w:b/>
+          <w:bCs/>
+        </w:rPr>
+        <w:t>Ir. Wildan Suharso</w:t>
+      </w:r>
+      <w:r>
+        <w:rPr>
+          <w:rFonts w:ascii="Times New Roman" w:hAnsi="Times New Roman" w:cs="Times New Roman"/>
+          <w:b/>
+          <w:bCs/>
+        </w:rPr>
+        <w:t xml:space="preserve"> </w:t>
+      </w:r>
+      <w:proofErr w:type="gramStart"/>
+      <w:r>
+        <w:rPr>
+          <w:rFonts w:ascii="Times New Roman" w:hAnsi="Times New Roman" w:cs="Times New Roman"/>
+          <w:b/>
+          <w:bCs/>
+        </w:rPr>
+        <w:t>S.Kom</w:t>
+      </w:r>
+      <w:proofErr w:type="gramEnd"/>
+      <w:r>
+        <w:rPr>
+          <w:rFonts w:ascii="Times New Roman" w:hAnsi="Times New Roman" w:cs="Times New Roman"/>
+          <w:b/>
+          <w:bCs/>
+        </w:rPr>
+        <w:t>., M.Kom</w:t>
+      </w:r>
+      <w:r>
+        <w:rPr>
+          <w:rFonts w:ascii="Times New Roman" w:hAnsi="Times New Roman" w:cs="Times New Roman"/>
+          <w:b/>
+          <w:bCs/>
+        </w:rPr>
+        <w:t>)</w:t>
+      </w:r>
+      <w:r>
+        <w:rPr>
+          <w:rFonts w:ascii="Times New Roman" w:hAnsi="Times New Roman" w:cs="Times New Roman"/>
+          <w:b/>
+          <w:bCs/>
+        </w:rPr>
+        <w:tab/>
+      </w:r>
+      <w:r>
+        <w:rPr>
+          <w:rFonts w:ascii="Times New Roman" w:hAnsi="Times New Roman" w:cs="Times New Roman"/>
+          <w:b/>
+          <w:bCs/>
+        </w:rPr>
+        <w:tab/>
+      </w:r>
+      <w:r>
+        <w:rPr>
+          <w:rFonts w:ascii="Times New Roman" w:hAnsi="Times New Roman" w:cs="Times New Roman"/>
+          <w:b/>
+          <w:bCs/>
+        </w:rPr>
+        <w:tab/>
+        <w:t>(</w:t>
+      </w:r>
+      <w:r>
+        <w:rPr>
+          <w:rFonts w:ascii="Times New Roman" w:hAnsi="Times New Roman" w:cs="Times New Roman"/>
+          <w:b/>
+          <w:bCs/>
+        </w:rPr>
+        <w:t>Briansyah Setio Wiyono, S.Kom., M.Kom.</w:t>
+      </w:r>
+      <w:r>
+        <w:rPr>
+          <w:rFonts w:ascii="Times New Roman" w:hAnsi="Times New Roman" w:cs="Times New Roman"/>
+          <w:b/>
+          <w:bCs/>
+        </w:rPr>
+        <w:t>)</w:t>
+      </w:r>
     </w:p>
     <w:p>
       <w:pPr>
@@ -2988,6 +3602,7 @@
   <w:style w:type="character" w:default="1" w:styleId="DefaultParagraphFont">
     <w:name w:val="Default Paragraph Font"/>
     <w:uiPriority w:val="1"/>
+    <w:semiHidden/>
     <w:unhideWhenUsed/>
   </w:style>
   <w:style w:type="table" w:default="1" w:styleId="TableNormal">

</xml_diff>